<commit_message>
update WMDR 2 build
</commit_message>
<xml_diff>
--- a/standard/wmdr2-DRAFT.docx
+++ b/standard/wmdr2-DRAFT.docx
@@ -45,7 +45,7 @@
         <w:pStyle w:val="Date"/>
       </w:pPr>
       <w:r>
-        <w:t xml:space="preserve">2026-09-21</w:t>
+        <w:t xml:space="preserve">2026-09-26</w:t>
       </w:r>
     </w:p>
     <w:p>
@@ -98,7 +98,7 @@
               <w:jc w:val="left"/>
             </w:pPr>
             <w:r>
-              <w:t xml:space="preserve">Date: 2026-09-21</w:t>
+              <w:t xml:space="preserve">Date: 2026-09-26</w:t>
             </w:r>
           </w:p>
         </w:tc>
@@ -111,7 +111,7 @@
               <w:jc w:val="left"/>
             </w:pPr>
             <w:r>
-              <w:t xml:space="preserve">Version: 1.99.dev0</w:t>
+              <w:t xml:space="preserve">Version: 1.99.dev1</w:t>
             </w:r>
           </w:p>
         </w:tc>
@@ -14022,7 +14022,7 @@
         <w:rPr>
           <w:rStyle w:val="CharTok"/>
         </w:rPr>
-        <w:t xml:space="preserve">\\\\</w:t>
+        <w:t xml:space="preserve">\\</w:t>
       </w:r>
       <w:r>
         <w:rPr>
@@ -14034,7 +14034,7 @@
         <w:rPr>
           <w:rStyle w:val="CharTok"/>
         </w:rPr>
-        <w:t xml:space="preserve">\\\\</w:t>
+        <w:t xml:space="preserve">\\</w:t>
       </w:r>
       <w:r>
         <w:rPr>
@@ -14046,7 +14046,7 @@
         <w:rPr>
           <w:rStyle w:val="CharTok"/>
         </w:rPr>
-        <w:t xml:space="preserve">\\\\</w:t>
+        <w:t xml:space="preserve">\\</w:t>
       </w:r>
       <w:r>
         <w:rPr>
@@ -14058,7 +14058,7 @@
         <w:rPr>
           <w:rStyle w:val="CharTok"/>
         </w:rPr>
-        <w:t xml:space="preserve">\\\\</w:t>
+        <w:t xml:space="preserve">\\</w:t>
       </w:r>
       <w:r>
         <w:rPr>
@@ -14070,7 +14070,7 @@
         <w:rPr>
           <w:rStyle w:val="CharTok"/>
         </w:rPr>
-        <w:t xml:space="preserve">\\\\</w:t>
+        <w:t xml:space="preserve">\\</w:t>
       </w:r>
       <w:r>
         <w:rPr>
@@ -14082,7 +14082,7 @@
         <w:rPr>
           <w:rStyle w:val="CharTok"/>
         </w:rPr>
-        <w:t xml:space="preserve">\\\\</w:t>
+        <w:t xml:space="preserve">\\</w:t>
       </w:r>
       <w:r>
         <w:rPr>
@@ -14094,7 +14094,7 @@
         <w:rPr>
           <w:rStyle w:val="CharTok"/>
         </w:rPr>
-        <w:t xml:space="preserve">\\\\</w:t>
+        <w:t xml:space="preserve">\\</w:t>
       </w:r>
       <w:r>
         <w:rPr>
@@ -14106,7 +14106,7 @@
         <w:rPr>
           <w:rStyle w:val="CharTok"/>
         </w:rPr>
-        <w:t xml:space="preserve">\\\\</w:t>
+        <w:t xml:space="preserve">\\</w:t>
       </w:r>
       <w:r>
         <w:rPr>
@@ -14118,7 +14118,7 @@
         <w:rPr>
           <w:rStyle w:val="CharTok"/>
         </w:rPr>
-        <w:t xml:space="preserve">\\\\</w:t>
+        <w:t xml:space="preserve">\\</w:t>
       </w:r>
       <w:r>
         <w:rPr>
@@ -14130,7 +14130,7 @@
         <w:rPr>
           <w:rStyle w:val="CharTok"/>
         </w:rPr>
-        <w:t xml:space="preserve">\\\\</w:t>
+        <w:t xml:space="preserve">\\</w:t>
       </w:r>
       <w:r>
         <w:rPr>
@@ -24954,7 +24954,7 @@
         <w:rPr>
           <w:rStyle w:val="DataTypeTok"/>
         </w:rPr>
-        <w:t xml:space="preserve">"oneOf"</w:t>
+        <w:t xml:space="preserve">"anyOf"</w:t>
       </w:r>
       <w:r>
         <w:rPr>
@@ -25110,94 +25110,25 @@
         <w:rPr>
           <w:rStyle w:val="DataTypeTok"/>
         </w:rPr>
-        <w:t xml:space="preserve">"type"</w:t>
-      </w:r>
-      <w:r>
-        <w:rPr>
-          <w:rStyle w:val="FunctionTok"/>
-        </w:rPr>
-        <w:t xml:space="preserve">:</w:t>
-      </w:r>
-      <w:r>
-        <w:rPr>
-          <w:rStyle w:val="NormalTok"/>
-        </w:rPr>
-        <w:t xml:space="preserve"> </w:t>
-      </w:r>
-      <w:r>
-        <w:rPr>
-          <w:rStyle w:val="StringTok"/>
-        </w:rPr>
-        <w:t xml:space="preserve">"string"</w:t>
-      </w:r>
-      <w:r>
-        <w:rPr>
-          <w:rStyle w:val="FunctionTok"/>
-        </w:rPr>
-        <w:t xml:space="preserve">,</w:t>
-      </w:r>
-      <w:r>
-        <w:br/>
-      </w:r>
-      <w:r>
-        <w:rPr>
-          <w:rStyle w:val="NormalTok"/>
-        </w:rPr>
-        <w:t xml:space="preserve">                      </w:t>
-      </w:r>
-      <w:r>
-        <w:rPr>
-          <w:rStyle w:val="DataTypeTok"/>
-        </w:rPr>
-        <w:t xml:space="preserve">"enum"</w:t>
-      </w:r>
-      <w:r>
-        <w:rPr>
-          <w:rStyle w:val="FunctionTok"/>
-        </w:rPr>
-        <w:t xml:space="preserve">:</w:t>
-      </w:r>
-      <w:r>
-        <w:rPr>
-          <w:rStyle w:val="NormalTok"/>
-        </w:rPr>
-        <w:t xml:space="preserve"> </w:t>
-      </w:r>
-      <w:r>
-        <w:rPr>
-          <w:rStyle w:val="OtherTok"/>
-        </w:rPr>
-        <w:t xml:space="preserve">[</w:t>
-      </w:r>
-      <w:r>
-        <w:br/>
-      </w:r>
-      <w:r>
-        <w:rPr>
-          <w:rStyle w:val="NormalTok"/>
-        </w:rPr>
-        <w:t xml:space="preserve">                        </w:t>
+        <w:t xml:space="preserve">"const"</w:t>
+      </w:r>
+      <w:r>
+        <w:rPr>
+          <w:rStyle w:val="FunctionTok"/>
+        </w:rPr>
+        <w:t xml:space="preserve">:</w:t>
+      </w:r>
+      <w:r>
+        <w:rPr>
+          <w:rStyle w:val="NormalTok"/>
+        </w:rPr>
+        <w:t xml:space="preserve"> </w:t>
       </w:r>
       <w:r>
         <w:rPr>
           <w:rStyle w:val="StringTok"/>
         </w:rPr>
         <w:t xml:space="preserve">".."</w:t>
-      </w:r>
-      <w:r>
-        <w:br/>
-      </w:r>
-      <w:r>
-        <w:rPr>
-          <w:rStyle w:val="NormalTok"/>
-        </w:rPr>
-        <w:t xml:space="preserve">                      </w:t>
-      </w:r>
-      <w:r>
-        <w:rPr>
-          <w:rStyle w:val="OtherTok"/>
-        </w:rPr>
-        <w:t xml:space="preserve">]</w:t>
       </w:r>
       <w:r>
         <w:br/>

</xml_diff>